<commit_message>
Informa a taxa de depreciação de máquinas e equipamentos
- Empresas novas e formação de preços: "(equipamento $ X, vida útil N
  anos)" passa a trazer também a taxa anual de depreciação.
- Conteúdo 1 da Agroindústria, Cervejaria e Usina: o enunciado não
  informava a vida útil das máquinas e dos móveis; agora cada ativo traz
  vida útil e taxa anual.
- Conteúdo 2 dessas empresas: a observação de vida útil inclui as taxas.
- Gabaritos do Conteúdo 1 dessas empresas: nota com a fórmula (valor ×
  taxa anual = valor ÷ vida útil) e as taxas usadas.
Taxas que não são exatas (1/12 e 1/15) vêm com a fração, para o cálculo
bater com o gabarito. Página e .docx; gabaritos cifrados de novo.

Co-Authored-By: Claude Opus 5.5 <noreply@anthropic.com>
Claude-Session: https://claude.ai/code/session_011MUGNEMWRsLJUKMUMKSx3L
</commit_message>
<xml_diff>
--- a/arquivos/Agroindustria_Grao_Dourado_Custos_MC_Enunciado.docx
+++ b/arquivos/Agroindustria_Grao_Dourado_Custos_MC_Enunciado.docx
@@ -628,7 +628,7 @@
                 <w:i w:val="false"/>
                 <w:iCs w:val="false"/>
               </w:rPr>
-              <w:t xml:space="preserve">Aquisição da prensa extrusora (expeller) de soja</w:t>
+              <w:t>Aquisição da prensa extrusora (expeller) de soja (vida útil 16 anos, taxa de depreciação de 6,25% a.a.)</w:t>
             </w:r>
           </w:p>
         </w:tc>
@@ -680,7 +680,7 @@
                 <w:i w:val="false"/>
                 <w:iCs w:val="false"/>
               </w:rPr>
-              <w:t xml:space="preserve">Aquisição da refinaria de óleo de soja</w:t>
+              <w:t>Aquisição da refinaria de óleo de soja (vida útil 12 anos, taxa de depreciação de 8,33% a.a., isto é, 1/12 do valor por ano)</w:t>
             </w:r>
           </w:p>
         </w:tc>
@@ -888,7 +888,7 @@
                 <w:i w:val="false"/>
                 <w:iCs w:val="false"/>
               </w:rPr>
-              <w:t xml:space="preserve">Móveis e computadores para o Setor Administrativo</w:t>
+              <w:t>Móveis e computadores para o Setor Administrativo (vida útil 10 anos, taxa de depreciação de 10% a.a.)</w:t>
             </w:r>
           </w:p>
         </w:tc>

</xml_diff>